<commit_message>
minh chung bai 3
</commit_message>
<xml_diff>
--- a/asd.docx
+++ b/asd.docx
@@ -291,10 +291,7 @@
         <w:t>Chạy container:</w:t>
       </w:r>
       <w:r>
-        <w:t xml:space="preserve"> </w:t>
-      </w:r>
-      <w:r>
-        <w:t>docker run -p 3000:3000 hello-docker</w:t>
+        <w:t xml:space="preserve"> docker run -p 3000:3000 hello-docker</w:t>
       </w:r>
     </w:p>
     <w:p>
@@ -575,12 +572,103 @@
       <w:pPr>
         <w:ind w:firstLine="0"/>
       </w:pPr>
-    </w:p>
-    <w:p>
-      <w:pPr>
-        <w:ind w:firstLine="0"/>
-      </w:pPr>
-      <w:r>
+      <w:r>
+        <w:rPr>
+          <w:noProof/>
+        </w:rPr>
+        <w:drawing>
+          <wp:inline distT="0" distB="0" distL="0" distR="0" wp14:anchorId="6DDDE491" wp14:editId="7D057093">
+            <wp:extent cx="5943600" cy="3343275"/>
+            <wp:effectExtent l="0" t="0" r="0" b="9525"/>
+            <wp:docPr id="521756116" name="Picture 1"/>
+            <wp:cNvGraphicFramePr>
+              <a:graphicFrameLocks xmlns:a="http://schemas.openxmlformats.org/drawingml/2006/main" noChangeAspect="1"/>
+            </wp:cNvGraphicFramePr>
+            <a:graphic xmlns:a="http://schemas.openxmlformats.org/drawingml/2006/main">
+              <a:graphicData uri="http://schemas.openxmlformats.org/drawingml/2006/picture">
+                <pic:pic xmlns:pic="http://schemas.openxmlformats.org/drawingml/2006/picture">
+                  <pic:nvPicPr>
+                    <pic:cNvPr id="521756116" name=""/>
+                    <pic:cNvPicPr/>
+                  </pic:nvPicPr>
+                  <pic:blipFill>
+                    <a:blip r:embed="rId15"/>
+                    <a:stretch>
+                      <a:fillRect/>
+                    </a:stretch>
+                  </pic:blipFill>
+                  <pic:spPr>
+                    <a:xfrm>
+                      <a:off x="0" y="0"/>
+                      <a:ext cx="5943600" cy="3343275"/>
+                    </a:xfrm>
+                    <a:prstGeom prst="rect">
+                      <a:avLst/>
+                    </a:prstGeom>
+                  </pic:spPr>
+                </pic:pic>
+              </a:graphicData>
+            </a:graphic>
+          </wp:inline>
+        </w:drawing>
+      </w:r>
+    </w:p>
+    <w:p>
+      <w:pPr>
+        <w:ind w:firstLine="0"/>
+      </w:pPr>
+      <w:r>
+        <w:rPr>
+          <w:noProof/>
+        </w:rPr>
+        <w:drawing>
+          <wp:inline distT="0" distB="0" distL="0" distR="0" wp14:anchorId="64337C2D" wp14:editId="2E4A783C">
+            <wp:extent cx="5943600" cy="379095"/>
+            <wp:effectExtent l="0" t="0" r="0" b="1905"/>
+            <wp:docPr id="597194129" name="Picture 1"/>
+            <wp:cNvGraphicFramePr>
+              <a:graphicFrameLocks xmlns:a="http://schemas.openxmlformats.org/drawingml/2006/main" noChangeAspect="1"/>
+            </wp:cNvGraphicFramePr>
+            <a:graphic xmlns:a="http://schemas.openxmlformats.org/drawingml/2006/main">
+              <a:graphicData uri="http://schemas.openxmlformats.org/drawingml/2006/picture">
+                <pic:pic xmlns:pic="http://schemas.openxmlformats.org/drawingml/2006/picture">
+                  <pic:nvPicPr>
+                    <pic:cNvPr id="597194129" name=""/>
+                    <pic:cNvPicPr/>
+                  </pic:nvPicPr>
+                  <pic:blipFill>
+                    <a:blip r:embed="rId16"/>
+                    <a:stretch>
+                      <a:fillRect/>
+                    </a:stretch>
+                  </pic:blipFill>
+                  <pic:spPr>
+                    <a:xfrm>
+                      <a:off x="0" y="0"/>
+                      <a:ext cx="5943600" cy="379095"/>
+                    </a:xfrm>
+                    <a:prstGeom prst="rect">
+                      <a:avLst/>
+                    </a:prstGeom>
+                  </pic:spPr>
+                </pic:pic>
+              </a:graphicData>
+            </a:graphic>
+          </wp:inline>
+        </w:drawing>
+      </w:r>
+    </w:p>
+    <w:p>
+      <w:pPr>
+        <w:ind w:firstLine="0"/>
+      </w:pPr>
+    </w:p>
+    <w:p>
+      <w:pPr>
+        <w:ind w:firstLine="0"/>
+      </w:pPr>
+      <w:r>
+        <w:lastRenderedPageBreak/>
         <w:t>Chạy container:</w:t>
       </w:r>
       <w:r>
@@ -595,8 +683,472 @@
         <w:ind w:firstLine="0"/>
       </w:pPr>
       <w:r>
+        <w:rPr>
+          <w:noProof/>
+        </w:rPr>
+        <w:drawing>
+          <wp:inline distT="0" distB="0" distL="0" distR="0" wp14:anchorId="408C7D4B" wp14:editId="4450802F">
+            <wp:extent cx="5943600" cy="3343275"/>
+            <wp:effectExtent l="0" t="0" r="0" b="9525"/>
+            <wp:docPr id="329333799" name="Picture 1"/>
+            <wp:cNvGraphicFramePr>
+              <a:graphicFrameLocks xmlns:a="http://schemas.openxmlformats.org/drawingml/2006/main" noChangeAspect="1"/>
+            </wp:cNvGraphicFramePr>
+            <a:graphic xmlns:a="http://schemas.openxmlformats.org/drawingml/2006/main">
+              <a:graphicData uri="http://schemas.openxmlformats.org/drawingml/2006/picture">
+                <pic:pic xmlns:pic="http://schemas.openxmlformats.org/drawingml/2006/picture">
+                  <pic:nvPicPr>
+                    <pic:cNvPr id="329333799" name=""/>
+                    <pic:cNvPicPr/>
+                  </pic:nvPicPr>
+                  <pic:blipFill>
+                    <a:blip r:embed="rId17"/>
+                    <a:stretch>
+                      <a:fillRect/>
+                    </a:stretch>
+                  </pic:blipFill>
+                  <pic:spPr>
+                    <a:xfrm>
+                      <a:off x="0" y="0"/>
+                      <a:ext cx="5943600" cy="3343275"/>
+                    </a:xfrm>
+                    <a:prstGeom prst="rect">
+                      <a:avLst/>
+                    </a:prstGeom>
+                  </pic:spPr>
+                </pic:pic>
+              </a:graphicData>
+            </a:graphic>
+          </wp:inline>
+        </w:drawing>
+      </w:r>
+    </w:p>
+    <w:p>
+      <w:pPr>
+        <w:ind w:firstLine="0"/>
+      </w:pPr>
+      <w:r>
         <w:t>Thử mở trình duyệt:</w:t>
       </w:r>
+    </w:p>
+    <w:p>
+      <w:pPr>
+        <w:ind w:firstLine="0"/>
+      </w:pPr>
+      <w:r>
+        <w:rPr>
+          <w:noProof/>
+        </w:rPr>
+        <w:drawing>
+          <wp:inline distT="0" distB="0" distL="0" distR="0" wp14:anchorId="21AC37BF" wp14:editId="60688E42">
+            <wp:extent cx="5943600" cy="285115"/>
+            <wp:effectExtent l="0" t="0" r="0" b="635"/>
+            <wp:docPr id="193510866" name="Picture 1"/>
+            <wp:cNvGraphicFramePr>
+              <a:graphicFrameLocks xmlns:a="http://schemas.openxmlformats.org/drawingml/2006/main" noChangeAspect="1"/>
+            </wp:cNvGraphicFramePr>
+            <a:graphic xmlns:a="http://schemas.openxmlformats.org/drawingml/2006/main">
+              <a:graphicData uri="http://schemas.openxmlformats.org/drawingml/2006/picture">
+                <pic:pic xmlns:pic="http://schemas.openxmlformats.org/drawingml/2006/picture">
+                  <pic:nvPicPr>
+                    <pic:cNvPr id="193510866" name=""/>
+                    <pic:cNvPicPr/>
+                  </pic:nvPicPr>
+                  <pic:blipFill>
+                    <a:blip r:embed="rId18"/>
+                    <a:stretch>
+                      <a:fillRect/>
+                    </a:stretch>
+                  </pic:blipFill>
+                  <pic:spPr>
+                    <a:xfrm>
+                      <a:off x="0" y="0"/>
+                      <a:ext cx="5943600" cy="285115"/>
+                    </a:xfrm>
+                    <a:prstGeom prst="rect">
+                      <a:avLst/>
+                    </a:prstGeom>
+                  </pic:spPr>
+                </pic:pic>
+              </a:graphicData>
+            </a:graphic>
+          </wp:inline>
+        </w:drawing>
+      </w:r>
+    </w:p>
+    <w:p>
+      <w:pPr>
+        <w:ind w:firstLine="0"/>
+      </w:pPr>
+      <w:r>
+        <w:t>Bài 3: Tạo Dockerfile chạy một ứng dụng React Yêu cầu: Viết Dockerfile để build và chạy một ứng dụng React. Sử dụng node:18-alpine làm base image.</w:t>
+      </w:r>
+    </w:p>
+    <w:p>
+      <w:pPr>
+        <w:ind w:firstLine="0"/>
+      </w:pPr>
+      <w:r>
+        <w:t xml:space="preserve">Tạo ứng dụng react cơ bản bằng lệnh </w:t>
+      </w:r>
+      <w:r>
+        <w:t>npx create-react-app my-react-app</w:t>
+      </w:r>
+      <w:r>
+        <w:t>:</w:t>
+      </w:r>
+    </w:p>
+    <w:p>
+      <w:pPr>
+        <w:ind w:firstLine="0"/>
+      </w:pPr>
+    </w:p>
+    <w:p>
+      <w:pPr>
+        <w:ind w:firstLine="0"/>
+      </w:pPr>
+      <w:r>
+        <w:rPr>
+          <w:noProof/>
+        </w:rPr>
+        <w:lastRenderedPageBreak/>
+        <w:drawing>
+          <wp:inline distT="0" distB="0" distL="0" distR="0" wp14:anchorId="391E646D" wp14:editId="3B2DA407">
+            <wp:extent cx="5943600" cy="3343275"/>
+            <wp:effectExtent l="0" t="0" r="0" b="9525"/>
+            <wp:docPr id="1456498752" name="Picture 1"/>
+            <wp:cNvGraphicFramePr>
+              <a:graphicFrameLocks xmlns:a="http://schemas.openxmlformats.org/drawingml/2006/main" noChangeAspect="1"/>
+            </wp:cNvGraphicFramePr>
+            <a:graphic xmlns:a="http://schemas.openxmlformats.org/drawingml/2006/main">
+              <a:graphicData uri="http://schemas.openxmlformats.org/drawingml/2006/picture">
+                <pic:pic xmlns:pic="http://schemas.openxmlformats.org/drawingml/2006/picture">
+                  <pic:nvPicPr>
+                    <pic:cNvPr id="1456498752" name=""/>
+                    <pic:cNvPicPr/>
+                  </pic:nvPicPr>
+                  <pic:blipFill>
+                    <a:blip r:embed="rId19"/>
+                    <a:stretch>
+                      <a:fillRect/>
+                    </a:stretch>
+                  </pic:blipFill>
+                  <pic:spPr>
+                    <a:xfrm>
+                      <a:off x="0" y="0"/>
+                      <a:ext cx="5943600" cy="3343275"/>
+                    </a:xfrm>
+                    <a:prstGeom prst="rect">
+                      <a:avLst/>
+                    </a:prstGeom>
+                  </pic:spPr>
+                </pic:pic>
+              </a:graphicData>
+            </a:graphic>
+          </wp:inline>
+        </w:drawing>
+      </w:r>
+    </w:p>
+    <w:p>
+      <w:pPr>
+        <w:ind w:firstLine="0"/>
+      </w:pPr>
+      <w:r>
+        <w:t>Viết docker file:</w:t>
+      </w:r>
+    </w:p>
+    <w:p>
+      <w:pPr>
+        <w:ind w:firstLine="0"/>
+      </w:pPr>
+      <w:r>
+        <w:rPr>
+          <w:noProof/>
+        </w:rPr>
+        <w:drawing>
+          <wp:inline distT="0" distB="0" distL="0" distR="0" wp14:anchorId="0717C48D" wp14:editId="0F796702">
+            <wp:extent cx="5943600" cy="3343275"/>
+            <wp:effectExtent l="0" t="0" r="0" b="9525"/>
+            <wp:docPr id="1372251926" name="Picture 1"/>
+            <wp:cNvGraphicFramePr>
+              <a:graphicFrameLocks xmlns:a="http://schemas.openxmlformats.org/drawingml/2006/main" noChangeAspect="1"/>
+            </wp:cNvGraphicFramePr>
+            <a:graphic xmlns:a="http://schemas.openxmlformats.org/drawingml/2006/main">
+              <a:graphicData uri="http://schemas.openxmlformats.org/drawingml/2006/picture">
+                <pic:pic xmlns:pic="http://schemas.openxmlformats.org/drawingml/2006/picture">
+                  <pic:nvPicPr>
+                    <pic:cNvPr id="1372251926" name=""/>
+                    <pic:cNvPicPr/>
+                  </pic:nvPicPr>
+                  <pic:blipFill>
+                    <a:blip r:embed="rId20"/>
+                    <a:stretch>
+                      <a:fillRect/>
+                    </a:stretch>
+                  </pic:blipFill>
+                  <pic:spPr>
+                    <a:xfrm>
+                      <a:off x="0" y="0"/>
+                      <a:ext cx="5943600" cy="3343275"/>
+                    </a:xfrm>
+                    <a:prstGeom prst="rect">
+                      <a:avLst/>
+                    </a:prstGeom>
+                  </pic:spPr>
+                </pic:pic>
+              </a:graphicData>
+            </a:graphic>
+          </wp:inline>
+        </w:drawing>
+      </w:r>
+    </w:p>
+    <w:p>
+      <w:pPr>
+        <w:ind w:firstLine="0"/>
+      </w:pPr>
+      <w:r>
+        <w:t xml:space="preserve">Build image: </w:t>
+      </w:r>
+      <w:r>
+        <w:t>docker build -t react-docker .</w:t>
+      </w:r>
+    </w:p>
+    <w:p>
+      <w:pPr>
+        <w:ind w:firstLine="0"/>
+      </w:pPr>
+      <w:r>
+        <w:rPr>
+          <w:noProof/>
+        </w:rPr>
+        <w:lastRenderedPageBreak/>
+        <w:drawing>
+          <wp:inline distT="0" distB="0" distL="0" distR="0" wp14:anchorId="5CB10730" wp14:editId="350A5085">
+            <wp:extent cx="5943600" cy="3343275"/>
+            <wp:effectExtent l="0" t="0" r="0" b="9525"/>
+            <wp:docPr id="254102272" name="Picture 1"/>
+            <wp:cNvGraphicFramePr>
+              <a:graphicFrameLocks xmlns:a="http://schemas.openxmlformats.org/drawingml/2006/main" noChangeAspect="1"/>
+            </wp:cNvGraphicFramePr>
+            <a:graphic xmlns:a="http://schemas.openxmlformats.org/drawingml/2006/main">
+              <a:graphicData uri="http://schemas.openxmlformats.org/drawingml/2006/picture">
+                <pic:pic xmlns:pic="http://schemas.openxmlformats.org/drawingml/2006/picture">
+                  <pic:nvPicPr>
+                    <pic:cNvPr id="254102272" name=""/>
+                    <pic:cNvPicPr/>
+                  </pic:nvPicPr>
+                  <pic:blipFill>
+                    <a:blip r:embed="rId21"/>
+                    <a:stretch>
+                      <a:fillRect/>
+                    </a:stretch>
+                  </pic:blipFill>
+                  <pic:spPr>
+                    <a:xfrm>
+                      <a:off x="0" y="0"/>
+                      <a:ext cx="5943600" cy="3343275"/>
+                    </a:xfrm>
+                    <a:prstGeom prst="rect">
+                      <a:avLst/>
+                    </a:prstGeom>
+                  </pic:spPr>
+                </pic:pic>
+              </a:graphicData>
+            </a:graphic>
+          </wp:inline>
+        </w:drawing>
+      </w:r>
+    </w:p>
+    <w:p>
+      <w:pPr>
+        <w:ind w:firstLine="0"/>
+      </w:pPr>
+      <w:r>
+        <w:rPr>
+          <w:noProof/>
+        </w:rPr>
+        <w:drawing>
+          <wp:inline distT="0" distB="0" distL="0" distR="0" wp14:anchorId="029CFFCA" wp14:editId="319953B0">
+            <wp:extent cx="5943600" cy="313690"/>
+            <wp:effectExtent l="0" t="0" r="0" b="0"/>
+            <wp:docPr id="1409153064" name="Picture 1"/>
+            <wp:cNvGraphicFramePr>
+              <a:graphicFrameLocks xmlns:a="http://schemas.openxmlformats.org/drawingml/2006/main" noChangeAspect="1"/>
+            </wp:cNvGraphicFramePr>
+            <a:graphic xmlns:a="http://schemas.openxmlformats.org/drawingml/2006/main">
+              <a:graphicData uri="http://schemas.openxmlformats.org/drawingml/2006/picture">
+                <pic:pic xmlns:pic="http://schemas.openxmlformats.org/drawingml/2006/picture">
+                  <pic:nvPicPr>
+                    <pic:cNvPr id="1409153064" name=""/>
+                    <pic:cNvPicPr/>
+                  </pic:nvPicPr>
+                  <pic:blipFill>
+                    <a:blip r:embed="rId22"/>
+                    <a:stretch>
+                      <a:fillRect/>
+                    </a:stretch>
+                  </pic:blipFill>
+                  <pic:spPr>
+                    <a:xfrm>
+                      <a:off x="0" y="0"/>
+                      <a:ext cx="5943600" cy="313690"/>
+                    </a:xfrm>
+                    <a:prstGeom prst="rect">
+                      <a:avLst/>
+                    </a:prstGeom>
+                  </pic:spPr>
+                </pic:pic>
+              </a:graphicData>
+            </a:graphic>
+          </wp:inline>
+        </w:drawing>
+      </w:r>
+    </w:p>
+    <w:p>
+      <w:pPr>
+        <w:ind w:firstLine="0"/>
+      </w:pPr>
+      <w:r>
+        <w:t xml:space="preserve">Chạy container </w:t>
+      </w:r>
+      <w:r>
+        <w:t>docker run -p 3000:80 react-docker</w:t>
+      </w:r>
+    </w:p>
+    <w:p>
+      <w:pPr>
+        <w:ind w:firstLine="0"/>
+      </w:pPr>
+      <w:r>
+        <w:rPr>
+          <w:noProof/>
+        </w:rPr>
+        <w:drawing>
+          <wp:inline distT="0" distB="0" distL="0" distR="0" wp14:anchorId="22F6C556" wp14:editId="51B867A0">
+            <wp:extent cx="5943600" cy="3343275"/>
+            <wp:effectExtent l="0" t="0" r="0" b="9525"/>
+            <wp:docPr id="1285378232" name="Picture 1"/>
+            <wp:cNvGraphicFramePr>
+              <a:graphicFrameLocks xmlns:a="http://schemas.openxmlformats.org/drawingml/2006/main" noChangeAspect="1"/>
+            </wp:cNvGraphicFramePr>
+            <a:graphic xmlns:a="http://schemas.openxmlformats.org/drawingml/2006/main">
+              <a:graphicData uri="http://schemas.openxmlformats.org/drawingml/2006/picture">
+                <pic:pic xmlns:pic="http://schemas.openxmlformats.org/drawingml/2006/picture">
+                  <pic:nvPicPr>
+                    <pic:cNvPr id="1285378232" name=""/>
+                    <pic:cNvPicPr/>
+                  </pic:nvPicPr>
+                  <pic:blipFill>
+                    <a:blip r:embed="rId23"/>
+                    <a:stretch>
+                      <a:fillRect/>
+                    </a:stretch>
+                  </pic:blipFill>
+                  <pic:spPr>
+                    <a:xfrm>
+                      <a:off x="0" y="0"/>
+                      <a:ext cx="5943600" cy="3343275"/>
+                    </a:xfrm>
+                    <a:prstGeom prst="rect">
+                      <a:avLst/>
+                    </a:prstGeom>
+                  </pic:spPr>
+                </pic:pic>
+              </a:graphicData>
+            </a:graphic>
+          </wp:inline>
+        </w:drawing>
+      </w:r>
+    </w:p>
+    <w:p>
+      <w:pPr>
+        <w:ind w:firstLine="0"/>
+      </w:pPr>
+      <w:r>
+        <w:t>Thử chạy trình duyệt:</w:t>
+      </w:r>
+    </w:p>
+    <w:p>
+      <w:pPr>
+        <w:ind w:firstLine="0"/>
+      </w:pPr>
+      <w:r>
+        <w:rPr>
+          <w:noProof/>
+        </w:rPr>
+        <w:lastRenderedPageBreak/>
+        <w:drawing>
+          <wp:inline distT="0" distB="0" distL="0" distR="0" wp14:anchorId="38E7A644" wp14:editId="214B70B0">
+            <wp:extent cx="5943600" cy="2548890"/>
+            <wp:effectExtent l="0" t="0" r="0" b="3810"/>
+            <wp:docPr id="67517105" name="Picture 1"/>
+            <wp:cNvGraphicFramePr>
+              <a:graphicFrameLocks xmlns:a="http://schemas.openxmlformats.org/drawingml/2006/main" noChangeAspect="1"/>
+            </wp:cNvGraphicFramePr>
+            <a:graphic xmlns:a="http://schemas.openxmlformats.org/drawingml/2006/main">
+              <a:graphicData uri="http://schemas.openxmlformats.org/drawingml/2006/picture">
+                <pic:pic xmlns:pic="http://schemas.openxmlformats.org/drawingml/2006/picture">
+                  <pic:nvPicPr>
+                    <pic:cNvPr id="67517105" name=""/>
+                    <pic:cNvPicPr/>
+                  </pic:nvPicPr>
+                  <pic:blipFill>
+                    <a:blip r:embed="rId24"/>
+                    <a:stretch>
+                      <a:fillRect/>
+                    </a:stretch>
+                  </pic:blipFill>
+                  <pic:spPr>
+                    <a:xfrm>
+                      <a:off x="0" y="0"/>
+                      <a:ext cx="5943600" cy="2548890"/>
+                    </a:xfrm>
+                    <a:prstGeom prst="rect">
+                      <a:avLst/>
+                    </a:prstGeom>
+                  </pic:spPr>
+                </pic:pic>
+              </a:graphicData>
+            </a:graphic>
+          </wp:inline>
+        </w:drawing>
+      </w:r>
+    </w:p>
+    <w:p>
+      <w:pPr>
+        <w:ind w:firstLine="0"/>
+      </w:pPr>
+      <w:r>
+        <w:t>Bài 4: Tạo Dockerfile chạy một trang web tĩnh bằng Nginx</w:t>
+      </w:r>
+      <w:r>
+        <w:tab/>
+      </w:r>
+    </w:p>
+    <w:p>
+      <w:pPr>
+        <w:ind w:firstLine="0"/>
+      </w:pPr>
+      <w:r>
+        <w:tab/>
+        <w:t>Yêu cầu:</w:t>
+      </w:r>
+      <w:r>
+        <w:t xml:space="preserve"> </w:t>
+      </w:r>
+      <w:r>
+        <w:t>Tạo một file index.html đơn giản và sử dụng nginx:latest để phục vụ trang web.</w:t>
+      </w:r>
+    </w:p>
+    <w:p>
+      <w:pPr>
+        <w:ind w:firstLine="0"/>
+      </w:pPr>
+    </w:p>
+    <w:p>
+      <w:pPr>
+        <w:ind w:firstLine="0"/>
+      </w:pPr>
     </w:p>
     <w:p>
       <w:pPr>

</xml_diff>

<commit_message>
Hoan thanh bai 4
</commit_message>
<xml_diff>
--- a/asd.docx
+++ b/asd.docx
@@ -33,6 +33,11 @@
       <w:r>
         <w:t xml:space="preserve">Câu 1: </w:t>
       </w:r>
+    </w:p>
+    <w:p>
+      <w:pPr>
+        <w:pStyle w:val="Heading2"/>
+      </w:pPr>
       <w:r>
         <w:t>Tạo Dockerfile chạy một ứng dụng Node.js đơn giản Yêu cầu: Viết Dockerfile để chạy một ứng dụng Node.js hiển thị "Hello, Docker!" trên cổng 3000. Sử dụng node:18 làm base image.</w:t>
       </w:r>
@@ -1144,6 +1149,349 @@
       <w:pPr>
         <w:ind w:firstLine="0"/>
       </w:pPr>
+      <w:r>
+        <w:t>Tạo index .html</w:t>
+      </w:r>
+    </w:p>
+    <w:p>
+      <w:pPr>
+        <w:ind w:firstLine="0"/>
+      </w:pPr>
+      <w:r>
+        <w:rPr>
+          <w:noProof/>
+        </w:rPr>
+        <w:drawing>
+          <wp:inline distT="0" distB="0" distL="0" distR="0" wp14:anchorId="3255F600" wp14:editId="2049CE7E">
+            <wp:extent cx="5943600" cy="3343275"/>
+            <wp:effectExtent l="0" t="0" r="0" b="9525"/>
+            <wp:docPr id="250975490" name="Picture 1"/>
+            <wp:cNvGraphicFramePr>
+              <a:graphicFrameLocks xmlns:a="http://schemas.openxmlformats.org/drawingml/2006/main" noChangeAspect="1"/>
+            </wp:cNvGraphicFramePr>
+            <a:graphic xmlns:a="http://schemas.openxmlformats.org/drawingml/2006/main">
+              <a:graphicData uri="http://schemas.openxmlformats.org/drawingml/2006/picture">
+                <pic:pic xmlns:pic="http://schemas.openxmlformats.org/drawingml/2006/picture">
+                  <pic:nvPicPr>
+                    <pic:cNvPr id="250975490" name=""/>
+                    <pic:cNvPicPr/>
+                  </pic:nvPicPr>
+                  <pic:blipFill>
+                    <a:blip r:embed="rId25"/>
+                    <a:stretch>
+                      <a:fillRect/>
+                    </a:stretch>
+                  </pic:blipFill>
+                  <pic:spPr>
+                    <a:xfrm>
+                      <a:off x="0" y="0"/>
+                      <a:ext cx="5943600" cy="3343275"/>
+                    </a:xfrm>
+                    <a:prstGeom prst="rect">
+                      <a:avLst/>
+                    </a:prstGeom>
+                  </pic:spPr>
+                </pic:pic>
+              </a:graphicData>
+            </a:graphic>
+          </wp:inline>
+        </w:drawing>
+      </w:r>
+    </w:p>
+    <w:p>
+      <w:pPr>
+        <w:ind w:firstLine="0"/>
+      </w:pPr>
+      <w:r>
+        <w:t>Viết docker file:</w:t>
+      </w:r>
+    </w:p>
+    <w:p>
+      <w:pPr>
+        <w:ind w:firstLine="0"/>
+      </w:pPr>
+      <w:r>
+        <w:rPr>
+          <w:noProof/>
+        </w:rPr>
+        <w:lastRenderedPageBreak/>
+        <w:drawing>
+          <wp:inline distT="0" distB="0" distL="0" distR="0" wp14:anchorId="31CE2C11" wp14:editId="5BE32AD7">
+            <wp:extent cx="5943600" cy="3343275"/>
+            <wp:effectExtent l="0" t="0" r="0" b="9525"/>
+            <wp:docPr id="1459946319" name="Picture 1"/>
+            <wp:cNvGraphicFramePr>
+              <a:graphicFrameLocks xmlns:a="http://schemas.openxmlformats.org/drawingml/2006/main" noChangeAspect="1"/>
+            </wp:cNvGraphicFramePr>
+            <a:graphic xmlns:a="http://schemas.openxmlformats.org/drawingml/2006/main">
+              <a:graphicData uri="http://schemas.openxmlformats.org/drawingml/2006/picture">
+                <pic:pic xmlns:pic="http://schemas.openxmlformats.org/drawingml/2006/picture">
+                  <pic:nvPicPr>
+                    <pic:cNvPr id="1459946319" name=""/>
+                    <pic:cNvPicPr/>
+                  </pic:nvPicPr>
+                  <pic:blipFill>
+                    <a:blip r:embed="rId26"/>
+                    <a:stretch>
+                      <a:fillRect/>
+                    </a:stretch>
+                  </pic:blipFill>
+                  <pic:spPr>
+                    <a:xfrm>
+                      <a:off x="0" y="0"/>
+                      <a:ext cx="5943600" cy="3343275"/>
+                    </a:xfrm>
+                    <a:prstGeom prst="rect">
+                      <a:avLst/>
+                    </a:prstGeom>
+                  </pic:spPr>
+                </pic:pic>
+              </a:graphicData>
+            </a:graphic>
+          </wp:inline>
+        </w:drawing>
+      </w:r>
+    </w:p>
+    <w:p>
+      <w:pPr>
+        <w:ind w:firstLine="0"/>
+      </w:pPr>
+      <w:r>
+        <w:t>Build image:</w:t>
+      </w:r>
+      <w:r>
+        <w:t>docker build -t nginx-static .</w:t>
+      </w:r>
+    </w:p>
+    <w:p>
+      <w:pPr>
+        <w:ind w:firstLine="0"/>
+      </w:pPr>
+      <w:r>
+        <w:rPr>
+          <w:noProof/>
+        </w:rPr>
+        <w:drawing>
+          <wp:inline distT="0" distB="0" distL="0" distR="0" wp14:anchorId="6D0CD4F3" wp14:editId="4B00480F">
+            <wp:extent cx="5943600" cy="3343275"/>
+            <wp:effectExtent l="0" t="0" r="0" b="9525"/>
+            <wp:docPr id="1506735482" name="Picture 1"/>
+            <wp:cNvGraphicFramePr>
+              <a:graphicFrameLocks xmlns:a="http://schemas.openxmlformats.org/drawingml/2006/main" noChangeAspect="1"/>
+            </wp:cNvGraphicFramePr>
+            <a:graphic xmlns:a="http://schemas.openxmlformats.org/drawingml/2006/main">
+              <a:graphicData uri="http://schemas.openxmlformats.org/drawingml/2006/picture">
+                <pic:pic xmlns:pic="http://schemas.openxmlformats.org/drawingml/2006/picture">
+                  <pic:nvPicPr>
+                    <pic:cNvPr id="1506735482" name=""/>
+                    <pic:cNvPicPr/>
+                  </pic:nvPicPr>
+                  <pic:blipFill>
+                    <a:blip r:embed="rId27"/>
+                    <a:stretch>
+                      <a:fillRect/>
+                    </a:stretch>
+                  </pic:blipFill>
+                  <pic:spPr>
+                    <a:xfrm>
+                      <a:off x="0" y="0"/>
+                      <a:ext cx="5943600" cy="3343275"/>
+                    </a:xfrm>
+                    <a:prstGeom prst="rect">
+                      <a:avLst/>
+                    </a:prstGeom>
+                  </pic:spPr>
+                </pic:pic>
+              </a:graphicData>
+            </a:graphic>
+          </wp:inline>
+        </w:drawing>
+      </w:r>
+    </w:p>
+    <w:p>
+      <w:pPr>
+        <w:ind w:firstLine="0"/>
+      </w:pPr>
+      <w:r>
+        <w:rPr>
+          <w:noProof/>
+        </w:rPr>
+        <w:drawing>
+          <wp:inline distT="0" distB="0" distL="0" distR="0" wp14:anchorId="7E09AFAB" wp14:editId="5F671052">
+            <wp:extent cx="5943600" cy="349250"/>
+            <wp:effectExtent l="0" t="0" r="0" b="0"/>
+            <wp:docPr id="146473007" name="Picture 1"/>
+            <wp:cNvGraphicFramePr>
+              <a:graphicFrameLocks xmlns:a="http://schemas.openxmlformats.org/drawingml/2006/main" noChangeAspect="1"/>
+            </wp:cNvGraphicFramePr>
+            <a:graphic xmlns:a="http://schemas.openxmlformats.org/drawingml/2006/main">
+              <a:graphicData uri="http://schemas.openxmlformats.org/drawingml/2006/picture">
+                <pic:pic xmlns:pic="http://schemas.openxmlformats.org/drawingml/2006/picture">
+                  <pic:nvPicPr>
+                    <pic:cNvPr id="146473007" name=""/>
+                    <pic:cNvPicPr/>
+                  </pic:nvPicPr>
+                  <pic:blipFill>
+                    <a:blip r:embed="rId28"/>
+                    <a:stretch>
+                      <a:fillRect/>
+                    </a:stretch>
+                  </pic:blipFill>
+                  <pic:spPr>
+                    <a:xfrm>
+                      <a:off x="0" y="0"/>
+                      <a:ext cx="5943600" cy="349250"/>
+                    </a:xfrm>
+                    <a:prstGeom prst="rect">
+                      <a:avLst/>
+                    </a:prstGeom>
+                  </pic:spPr>
+                </pic:pic>
+              </a:graphicData>
+            </a:graphic>
+          </wp:inline>
+        </w:drawing>
+      </w:r>
+    </w:p>
+    <w:p>
+      <w:pPr>
+        <w:ind w:firstLine="0"/>
+      </w:pPr>
+    </w:p>
+    <w:p>
+      <w:pPr>
+        <w:ind w:firstLine="0"/>
+      </w:pPr>
+      <w:r>
+        <w:lastRenderedPageBreak/>
+        <w:t>Chạy container:</w:t>
+      </w:r>
+      <w:r>
+        <w:t xml:space="preserve"> d</w:t>
+      </w:r>
+      <w:r>
+        <w:t>ocker run -p 8080:80 nginx-static</w:t>
+      </w:r>
+    </w:p>
+    <w:p>
+      <w:pPr>
+        <w:ind w:firstLine="0"/>
+      </w:pPr>
+      <w:r>
+        <w:rPr>
+          <w:noProof/>
+        </w:rPr>
+        <w:drawing>
+          <wp:inline distT="0" distB="0" distL="0" distR="0" wp14:anchorId="14EB8B39" wp14:editId="5CAFB80E">
+            <wp:extent cx="5943600" cy="3343275"/>
+            <wp:effectExtent l="0" t="0" r="0" b="9525"/>
+            <wp:docPr id="1234439727" name="Picture 1"/>
+            <wp:cNvGraphicFramePr>
+              <a:graphicFrameLocks xmlns:a="http://schemas.openxmlformats.org/drawingml/2006/main" noChangeAspect="1"/>
+            </wp:cNvGraphicFramePr>
+            <a:graphic xmlns:a="http://schemas.openxmlformats.org/drawingml/2006/main">
+              <a:graphicData uri="http://schemas.openxmlformats.org/drawingml/2006/picture">
+                <pic:pic xmlns:pic="http://schemas.openxmlformats.org/drawingml/2006/picture">
+                  <pic:nvPicPr>
+                    <pic:cNvPr id="1234439727" name=""/>
+                    <pic:cNvPicPr/>
+                  </pic:nvPicPr>
+                  <pic:blipFill>
+                    <a:blip r:embed="rId29"/>
+                    <a:stretch>
+                      <a:fillRect/>
+                    </a:stretch>
+                  </pic:blipFill>
+                  <pic:spPr>
+                    <a:xfrm>
+                      <a:off x="0" y="0"/>
+                      <a:ext cx="5943600" cy="3343275"/>
+                    </a:xfrm>
+                    <a:prstGeom prst="rect">
+                      <a:avLst/>
+                    </a:prstGeom>
+                  </pic:spPr>
+                </pic:pic>
+              </a:graphicData>
+            </a:graphic>
+          </wp:inline>
+        </w:drawing>
+      </w:r>
+    </w:p>
+    <w:p>
+      <w:pPr>
+        <w:ind w:firstLine="0"/>
+      </w:pPr>
+      <w:r>
+        <w:t>Thử chạy trình duyệt:</w:t>
+      </w:r>
+    </w:p>
+    <w:p>
+      <w:pPr>
+        <w:ind w:firstLine="0"/>
+      </w:pPr>
+      <w:r>
+        <w:rPr>
+          <w:noProof/>
+        </w:rPr>
+        <w:drawing>
+          <wp:inline distT="0" distB="0" distL="0" distR="0" wp14:anchorId="190FBF33" wp14:editId="4655FA1E">
+            <wp:extent cx="5943600" cy="433705"/>
+            <wp:effectExtent l="0" t="0" r="0" b="4445"/>
+            <wp:docPr id="122691006" name="Picture 1"/>
+            <wp:cNvGraphicFramePr>
+              <a:graphicFrameLocks xmlns:a="http://schemas.openxmlformats.org/drawingml/2006/main" noChangeAspect="1"/>
+            </wp:cNvGraphicFramePr>
+            <a:graphic xmlns:a="http://schemas.openxmlformats.org/drawingml/2006/main">
+              <a:graphicData uri="http://schemas.openxmlformats.org/drawingml/2006/picture">
+                <pic:pic xmlns:pic="http://schemas.openxmlformats.org/drawingml/2006/picture">
+                  <pic:nvPicPr>
+                    <pic:cNvPr id="122691006" name=""/>
+                    <pic:cNvPicPr/>
+                  </pic:nvPicPr>
+                  <pic:blipFill>
+                    <a:blip r:embed="rId30"/>
+                    <a:stretch>
+                      <a:fillRect/>
+                    </a:stretch>
+                  </pic:blipFill>
+                  <pic:spPr>
+                    <a:xfrm>
+                      <a:off x="0" y="0"/>
+                      <a:ext cx="5943600" cy="433705"/>
+                    </a:xfrm>
+                    <a:prstGeom prst="rect">
+                      <a:avLst/>
+                    </a:prstGeom>
+                  </pic:spPr>
+                </pic:pic>
+              </a:graphicData>
+            </a:graphic>
+          </wp:inline>
+        </w:drawing>
+      </w:r>
+    </w:p>
+    <w:p>
+      <w:pPr>
+        <w:ind w:firstLine="0"/>
+      </w:pPr>
+      <w:r>
+        <w:t xml:space="preserve">Bài 5: Tạo Dockerfile cho ứng dụng Go </w:t>
+      </w:r>
+    </w:p>
+    <w:p>
+      <w:pPr>
+        <w:ind w:firstLine="0"/>
+      </w:pPr>
+      <w:r>
+        <w:t xml:space="preserve">Yêu cầu: </w:t>
+      </w:r>
+      <w:r>
+        <w:t xml:space="preserve"> </w:t>
+      </w:r>
+      <w:r>
+        <w:t>Viết Dockerfile để build và chạy một ứng dụng Go đơn giản.</w:t>
+      </w:r>
     </w:p>
     <w:p>
       <w:pPr>

</xml_diff>

<commit_message>
hoan thanh bai 5
</commit_message>
<xml_diff>
--- a/asd.docx
+++ b/asd.docx
@@ -21,6 +21,11 @@
     <w:p>
       <w:pPr>
         <w:pStyle w:val="Heading1"/>
+        <w:numPr>
+          <w:ilvl w:val="0"/>
+          <w:numId w:val="0"/>
+        </w:numPr>
+        <w:ind w:left="360" w:hanging="360"/>
       </w:pPr>
       <w:r>
         <w:t>Bài 2</w:t>
@@ -31,13 +36,10 @@
         <w:pStyle w:val="Heading2"/>
       </w:pPr>
       <w:r>
-        <w:t xml:space="preserve">Câu 1: </w:t>
-      </w:r>
-    </w:p>
-    <w:p>
-      <w:pPr>
-        <w:pStyle w:val="Heading2"/>
-      </w:pPr>
+        <w:t>Câu 1:</w:t>
+      </w:r>
+    </w:p>
+    <w:p>
       <w:r>
         <w:t>Tạo Dockerfile chạy một ứng dụng Node.js đơn giản Yêu cầu: Viết Dockerfile để chạy một ứng dụng Node.js hiển thị "Hello, Docker!" trên cổng 3000. Sử dụng node:18 làm base image.</w:t>
       </w:r>
@@ -400,10 +402,34 @@
     </w:p>
     <w:p>
       <w:pPr>
-        <w:ind w:firstLine="0"/>
-      </w:pPr>
-      <w:r>
-        <w:t>Bài 2: Tạo Dockerfile chạy một ứng dụng Python Flask Yêu cầu: Viết Dockerfile để chạy một ứng dụng Flask hiển thị "Hello, Docker Flask!" trên cổng 5000. Sử dụng python:3.9 làm base image.</w:t>
+        <w:pStyle w:val="Heading2"/>
+        <w:rPr>
+          <w:b w:val="0"/>
+          <w:bCs/>
+        </w:rPr>
+      </w:pPr>
+      <w:r>
+        <w:rPr>
+          <w:rStyle w:val="Heading2Char"/>
+          <w:b/>
+          <w:bCs/>
+        </w:rPr>
+        <w:t>Câu 2:</w:t>
+      </w:r>
+      <w:r>
+        <w:rPr>
+          <w:b w:val="0"/>
+          <w:bCs/>
+        </w:rPr>
+        <w:t xml:space="preserve"> </w:t>
+      </w:r>
+    </w:p>
+    <w:p>
+      <w:pPr>
+        <w:ind w:firstLine="0"/>
+      </w:pPr>
+      <w:r>
+        <w:t>Tạo Dockerfile chạy một ứng dụng Python Flask Yêu cầu: Viết Dockerfile để chạy một ứng dụng Flask hiển thị "Hello, Docker Flask!" trên cổng 5000. Sử dụng python:3.9 làm base image.</w:t>
       </w:r>
     </w:p>
     <w:p>
@@ -783,10 +809,42 @@
     </w:p>
     <w:p>
       <w:pPr>
-        <w:ind w:firstLine="0"/>
-      </w:pPr>
-      <w:r>
-        <w:t>Bài 3: Tạo Dockerfile chạy một ứng dụng React Yêu cầu: Viết Dockerfile để build và chạy một ứng dụng React. Sử dụng node:18-alpine làm base image.</w:t>
+        <w:pStyle w:val="Heading2"/>
+        <w:rPr>
+          <w:b w:val="0"/>
+          <w:bCs/>
+        </w:rPr>
+      </w:pPr>
+      <w:r>
+        <w:rPr>
+          <w:rStyle w:val="Heading2Char"/>
+          <w:b/>
+          <w:bCs/>
+        </w:rPr>
+        <w:t>Câu 3</w:t>
+      </w:r>
+      <w:r>
+        <w:rPr>
+          <w:rStyle w:val="Heading2Char"/>
+          <w:b/>
+          <w:bCs/>
+        </w:rPr>
+        <w:t>:</w:t>
+      </w:r>
+      <w:r>
+        <w:rPr>
+          <w:b w:val="0"/>
+          <w:bCs/>
+        </w:rPr>
+        <w:t xml:space="preserve"> </w:t>
+      </w:r>
+    </w:p>
+    <w:p>
+      <w:pPr>
+        <w:ind w:firstLine="0"/>
+      </w:pPr>
+      <w:r>
+        <w:t>Tạo Dockerfile chạy một ứng dụng React Yêu cầu: Viết Dockerfile để build và chạy một ứng dụng React. Sử dụng node:18-alpine làm base image.</w:t>
       </w:r>
     </w:p>
     <w:p>
@@ -1121,10 +1179,21 @@
     </w:p>
     <w:p>
       <w:pPr>
-        <w:ind w:firstLine="0"/>
-      </w:pPr>
-      <w:r>
-        <w:t>Bài 4: Tạo Dockerfile chạy một trang web tĩnh bằng Nginx</w:t>
+        <w:pStyle w:val="Heading2"/>
+      </w:pPr>
+      <w:r>
+        <w:t>Câu 4</w:t>
+      </w:r>
+      <w:r>
+        <w:t xml:space="preserve">: </w:t>
+      </w:r>
+    </w:p>
+    <w:p>
+      <w:pPr>
+        <w:ind w:firstLine="0"/>
+      </w:pPr>
+      <w:r>
+        <w:t>Tạo Dockerfile chạy một trang web tĩnh bằng Nginx</w:t>
       </w:r>
       <w:r>
         <w:tab/>
@@ -1135,7 +1204,6 @@
         <w:ind w:firstLine="0"/>
       </w:pPr>
       <w:r>
-        <w:tab/>
         <w:t>Yêu cầu:</w:t>
       </w:r>
       <w:r>
@@ -1473,10 +1541,21 @@
     </w:p>
     <w:p>
       <w:pPr>
-        <w:ind w:firstLine="0"/>
-      </w:pPr>
-      <w:r>
-        <w:t xml:space="preserve">Bài 5: Tạo Dockerfile cho ứng dụng Go </w:t>
+        <w:pStyle w:val="Heading2"/>
+      </w:pPr>
+      <w:r>
+        <w:t>Câu 5</w:t>
+      </w:r>
+      <w:r>
+        <w:t xml:space="preserve">: </w:t>
+      </w:r>
+    </w:p>
+    <w:p>
+      <w:pPr>
+        <w:ind w:firstLine="0"/>
+      </w:pPr>
+      <w:r>
+        <w:t xml:space="preserve">Tạo Dockerfile cho ứng dụng Go </w:t>
       </w:r>
     </w:p>
     <w:p>
@@ -1497,12 +1576,336 @@
       <w:pPr>
         <w:ind w:firstLine="0"/>
       </w:pPr>
-    </w:p>
-    <w:p>
-      <w:pPr>
-        <w:ind w:firstLine="0"/>
-      </w:pPr>
-    </w:p>
+      <w:r>
+        <w:t>Tạo main.go:</w:t>
+      </w:r>
+    </w:p>
+    <w:p>
+      <w:pPr>
+        <w:ind w:firstLine="0"/>
+      </w:pPr>
+      <w:r>
+        <w:rPr>
+          <w:noProof/>
+        </w:rPr>
+        <w:lastRenderedPageBreak/>
+        <w:drawing>
+          <wp:inline distT="0" distB="0" distL="0" distR="0" wp14:anchorId="49317723" wp14:editId="46FA769B">
+            <wp:extent cx="5943600" cy="3343275"/>
+            <wp:effectExtent l="0" t="0" r="0" b="9525"/>
+            <wp:docPr id="1440624028" name="Picture 1"/>
+            <wp:cNvGraphicFramePr>
+              <a:graphicFrameLocks xmlns:a="http://schemas.openxmlformats.org/drawingml/2006/main" noChangeAspect="1"/>
+            </wp:cNvGraphicFramePr>
+            <a:graphic xmlns:a="http://schemas.openxmlformats.org/drawingml/2006/main">
+              <a:graphicData uri="http://schemas.openxmlformats.org/drawingml/2006/picture">
+                <pic:pic xmlns:pic="http://schemas.openxmlformats.org/drawingml/2006/picture">
+                  <pic:nvPicPr>
+                    <pic:cNvPr id="1440624028" name=""/>
+                    <pic:cNvPicPr/>
+                  </pic:nvPicPr>
+                  <pic:blipFill>
+                    <a:blip r:embed="rId31"/>
+                    <a:stretch>
+                      <a:fillRect/>
+                    </a:stretch>
+                  </pic:blipFill>
+                  <pic:spPr>
+                    <a:xfrm>
+                      <a:off x="0" y="0"/>
+                      <a:ext cx="5943600" cy="3343275"/>
+                    </a:xfrm>
+                    <a:prstGeom prst="rect">
+                      <a:avLst/>
+                    </a:prstGeom>
+                  </pic:spPr>
+                </pic:pic>
+              </a:graphicData>
+            </a:graphic>
+          </wp:inline>
+        </w:drawing>
+      </w:r>
+    </w:p>
+    <w:p>
+      <w:pPr>
+        <w:ind w:firstLine="0"/>
+      </w:pPr>
+      <w:r>
+        <w:t>Viết docker file:</w:t>
+      </w:r>
+    </w:p>
+    <w:p>
+      <w:pPr>
+        <w:ind w:firstLine="0"/>
+      </w:pPr>
+      <w:r>
+        <w:rPr>
+          <w:noProof/>
+        </w:rPr>
+        <w:drawing>
+          <wp:inline distT="0" distB="0" distL="0" distR="0" wp14:anchorId="74449EBC" wp14:editId="3693513E">
+            <wp:extent cx="5943600" cy="3343275"/>
+            <wp:effectExtent l="0" t="0" r="0" b="9525"/>
+            <wp:docPr id="2067034044" name="Picture 1"/>
+            <wp:cNvGraphicFramePr>
+              <a:graphicFrameLocks xmlns:a="http://schemas.openxmlformats.org/drawingml/2006/main" noChangeAspect="1"/>
+            </wp:cNvGraphicFramePr>
+            <a:graphic xmlns:a="http://schemas.openxmlformats.org/drawingml/2006/main">
+              <a:graphicData uri="http://schemas.openxmlformats.org/drawingml/2006/picture">
+                <pic:pic xmlns:pic="http://schemas.openxmlformats.org/drawingml/2006/picture">
+                  <pic:nvPicPr>
+                    <pic:cNvPr id="2067034044" name=""/>
+                    <pic:cNvPicPr/>
+                  </pic:nvPicPr>
+                  <pic:blipFill>
+                    <a:blip r:embed="rId32"/>
+                    <a:stretch>
+                      <a:fillRect/>
+                    </a:stretch>
+                  </pic:blipFill>
+                  <pic:spPr>
+                    <a:xfrm>
+                      <a:off x="0" y="0"/>
+                      <a:ext cx="5943600" cy="3343275"/>
+                    </a:xfrm>
+                    <a:prstGeom prst="rect">
+                      <a:avLst/>
+                    </a:prstGeom>
+                  </pic:spPr>
+                </pic:pic>
+              </a:graphicData>
+            </a:graphic>
+          </wp:inline>
+        </w:drawing>
+      </w:r>
+    </w:p>
+    <w:p>
+      <w:pPr>
+        <w:ind w:firstLine="0"/>
+      </w:pPr>
+      <w:r>
+        <w:t>Build image:</w:t>
+      </w:r>
+      <w:r>
+        <w:t xml:space="preserve"> </w:t>
+      </w:r>
+      <w:r>
+        <w:t>docker build -t go-docker .</w:t>
+      </w:r>
+    </w:p>
+    <w:p>
+      <w:pPr>
+        <w:ind w:firstLine="0"/>
+      </w:pPr>
+      <w:r>
+        <w:rPr>
+          <w:noProof/>
+        </w:rPr>
+        <w:lastRenderedPageBreak/>
+        <w:drawing>
+          <wp:inline distT="0" distB="0" distL="0" distR="0" wp14:anchorId="4D0DE4B4" wp14:editId="41AF7BA1">
+            <wp:extent cx="5943600" cy="3343275"/>
+            <wp:effectExtent l="0" t="0" r="0" b="9525"/>
+            <wp:docPr id="1069685550" name="Picture 1"/>
+            <wp:cNvGraphicFramePr>
+              <a:graphicFrameLocks xmlns:a="http://schemas.openxmlformats.org/drawingml/2006/main" noChangeAspect="1"/>
+            </wp:cNvGraphicFramePr>
+            <a:graphic xmlns:a="http://schemas.openxmlformats.org/drawingml/2006/main">
+              <a:graphicData uri="http://schemas.openxmlformats.org/drawingml/2006/picture">
+                <pic:pic xmlns:pic="http://schemas.openxmlformats.org/drawingml/2006/picture">
+                  <pic:nvPicPr>
+                    <pic:cNvPr id="1069685550" name=""/>
+                    <pic:cNvPicPr/>
+                  </pic:nvPicPr>
+                  <pic:blipFill>
+                    <a:blip r:embed="rId33"/>
+                    <a:stretch>
+                      <a:fillRect/>
+                    </a:stretch>
+                  </pic:blipFill>
+                  <pic:spPr>
+                    <a:xfrm>
+                      <a:off x="0" y="0"/>
+                      <a:ext cx="5943600" cy="3343275"/>
+                    </a:xfrm>
+                    <a:prstGeom prst="rect">
+                      <a:avLst/>
+                    </a:prstGeom>
+                  </pic:spPr>
+                </pic:pic>
+              </a:graphicData>
+            </a:graphic>
+          </wp:inline>
+        </w:drawing>
+      </w:r>
+    </w:p>
+    <w:p>
+      <w:pPr>
+        <w:ind w:firstLine="0"/>
+      </w:pPr>
+      <w:r>
+        <w:rPr>
+          <w:noProof/>
+        </w:rPr>
+        <w:drawing>
+          <wp:inline distT="0" distB="0" distL="0" distR="0" wp14:anchorId="35811A3A" wp14:editId="56619B3D">
+            <wp:extent cx="5943600" cy="375285"/>
+            <wp:effectExtent l="0" t="0" r="0" b="5715"/>
+            <wp:docPr id="1460615922" name="Picture 1"/>
+            <wp:cNvGraphicFramePr>
+              <a:graphicFrameLocks xmlns:a="http://schemas.openxmlformats.org/drawingml/2006/main" noChangeAspect="1"/>
+            </wp:cNvGraphicFramePr>
+            <a:graphic xmlns:a="http://schemas.openxmlformats.org/drawingml/2006/main">
+              <a:graphicData uri="http://schemas.openxmlformats.org/drawingml/2006/picture">
+                <pic:pic xmlns:pic="http://schemas.openxmlformats.org/drawingml/2006/picture">
+                  <pic:nvPicPr>
+                    <pic:cNvPr id="1460615922" name=""/>
+                    <pic:cNvPicPr/>
+                  </pic:nvPicPr>
+                  <pic:blipFill>
+                    <a:blip r:embed="rId34"/>
+                    <a:stretch>
+                      <a:fillRect/>
+                    </a:stretch>
+                  </pic:blipFill>
+                  <pic:spPr>
+                    <a:xfrm>
+                      <a:off x="0" y="0"/>
+                      <a:ext cx="5943600" cy="375285"/>
+                    </a:xfrm>
+                    <a:prstGeom prst="rect">
+                      <a:avLst/>
+                    </a:prstGeom>
+                  </pic:spPr>
+                </pic:pic>
+              </a:graphicData>
+            </a:graphic>
+          </wp:inline>
+        </w:drawing>
+      </w:r>
+    </w:p>
+    <w:p>
+      <w:pPr>
+        <w:ind w:firstLine="0"/>
+      </w:pPr>
+      <w:r>
+        <w:t>Chạy container:</w:t>
+      </w:r>
+      <w:r>
+        <w:t xml:space="preserve"> </w:t>
+      </w:r>
+      <w:r>
+        <w:t>docker run -p 8080:8080 go-docker</w:t>
+      </w:r>
+    </w:p>
+    <w:p>
+      <w:pPr>
+        <w:ind w:firstLine="0"/>
+      </w:pPr>
+      <w:r>
+        <w:rPr>
+          <w:noProof/>
+        </w:rPr>
+        <w:drawing>
+          <wp:inline distT="0" distB="0" distL="0" distR="0" wp14:anchorId="75A7CC3E" wp14:editId="56EB133A">
+            <wp:extent cx="5943600" cy="3343275"/>
+            <wp:effectExtent l="0" t="0" r="0" b="9525"/>
+            <wp:docPr id="117840154" name="Picture 1"/>
+            <wp:cNvGraphicFramePr>
+              <a:graphicFrameLocks xmlns:a="http://schemas.openxmlformats.org/drawingml/2006/main" noChangeAspect="1"/>
+            </wp:cNvGraphicFramePr>
+            <a:graphic xmlns:a="http://schemas.openxmlformats.org/drawingml/2006/main">
+              <a:graphicData uri="http://schemas.openxmlformats.org/drawingml/2006/picture">
+                <pic:pic xmlns:pic="http://schemas.openxmlformats.org/drawingml/2006/picture">
+                  <pic:nvPicPr>
+                    <pic:cNvPr id="117840154" name=""/>
+                    <pic:cNvPicPr/>
+                  </pic:nvPicPr>
+                  <pic:blipFill>
+                    <a:blip r:embed="rId35"/>
+                    <a:stretch>
+                      <a:fillRect/>
+                    </a:stretch>
+                  </pic:blipFill>
+                  <pic:spPr>
+                    <a:xfrm>
+                      <a:off x="0" y="0"/>
+                      <a:ext cx="5943600" cy="3343275"/>
+                    </a:xfrm>
+                    <a:prstGeom prst="rect">
+                      <a:avLst/>
+                    </a:prstGeom>
+                  </pic:spPr>
+                </pic:pic>
+              </a:graphicData>
+            </a:graphic>
+          </wp:inline>
+        </w:drawing>
+      </w:r>
+    </w:p>
+    <w:p>
+      <w:pPr>
+        <w:ind w:firstLine="0"/>
+      </w:pPr>
+      <w:r>
+        <w:t>Thử chạy trình duyệt:</w:t>
+      </w:r>
+    </w:p>
+    <w:p>
+      <w:pPr>
+        <w:ind w:firstLine="0"/>
+      </w:pPr>
+      <w:r>
+        <w:rPr>
+          <w:noProof/>
+        </w:rPr>
+        <w:lastRenderedPageBreak/>
+        <w:drawing>
+          <wp:inline distT="0" distB="0" distL="0" distR="0" wp14:anchorId="55F213EF" wp14:editId="6BCF432F">
+            <wp:extent cx="5943600" cy="266700"/>
+            <wp:effectExtent l="0" t="0" r="0" b="0"/>
+            <wp:docPr id="1268685828" name="Picture 1"/>
+            <wp:cNvGraphicFramePr>
+              <a:graphicFrameLocks xmlns:a="http://schemas.openxmlformats.org/drawingml/2006/main" noChangeAspect="1"/>
+            </wp:cNvGraphicFramePr>
+            <a:graphic xmlns:a="http://schemas.openxmlformats.org/drawingml/2006/main">
+              <a:graphicData uri="http://schemas.openxmlformats.org/drawingml/2006/picture">
+                <pic:pic xmlns:pic="http://schemas.openxmlformats.org/drawingml/2006/picture">
+                  <pic:nvPicPr>
+                    <pic:cNvPr id="1268685828" name=""/>
+                    <pic:cNvPicPr/>
+                  </pic:nvPicPr>
+                  <pic:blipFill>
+                    <a:blip r:embed="rId36"/>
+                    <a:stretch>
+                      <a:fillRect/>
+                    </a:stretch>
+                  </pic:blipFill>
+                  <pic:spPr>
+                    <a:xfrm>
+                      <a:off x="0" y="0"/>
+                      <a:ext cx="5943600" cy="266700"/>
+                    </a:xfrm>
+                    <a:prstGeom prst="rect">
+                      <a:avLst/>
+                    </a:prstGeom>
+                  </pic:spPr>
+                </pic:pic>
+              </a:graphicData>
+            </a:graphic>
+          </wp:inline>
+        </w:drawing>
+      </w:r>
+    </w:p>
+    <w:p>
+      <w:pPr>
+        <w:pStyle w:val="Heading2"/>
+      </w:pPr>
+      <w:r>
+        <w:t>Câu 6:</w:t>
+      </w:r>
+    </w:p>
+    <w:p/>
     <w:sectPr>
       <w:pgSz w:w="12240" w:h="15840"/>
       <w:pgMar w:top="1440" w:right="1440" w:bottom="1440" w:left="1440" w:header="720" w:footer="720" w:gutter="0"/>

</xml_diff>